<commit_message>
ADR-06: resolución explícita del contexto de iglesia
</commit_message>
<xml_diff>
--- a/docs/ADR/ADR-04-payment-transactional.docx
+++ b/docs/ADR/ADR-04-payment-transactional.docx
@@ -1336,6 +1336,14 @@
           </wp:inline>
         </w:drawing>
       </w:r>
+    </w:p>
+    <w:p>
+      <w:pPr>
+        <w:rPr>
+          <w:b/>
+          <w:bCs/>
+        </w:rPr>
+      </w:pPr>
       <w:r>
         <w:rPr>
           <w:b/>
@@ -1359,12 +1367,12 @@
     </w:p>
     <w:p>
       <w:r>
+        <w:lastRenderedPageBreak/>
         <w:t>La clase quedó definida así:</w:t>
       </w:r>
     </w:p>
     <w:p>
       <w:r>
-        <w:lastRenderedPageBreak/>
         <w:t>@Service</w:t>
       </w:r>
       <w:r>
@@ -1500,6 +1508,9 @@
         </w:rPr>
       </w:pPr>
       <w:r>
+        <w:rPr>
+          <w:noProof/>
+        </w:rPr>
         <w:drawing>
           <wp:inline distT="0" distB="0" distL="0" distR="0" wp14:anchorId="13679059" wp14:editId="07196FB1">
             <wp:extent cx="5612130" cy="1989455"/>
@@ -1602,6 +1613,7 @@
           <w:rFonts w:ascii="Segoe UI Emoji" w:hAnsi="Segoe UI Emoji" w:cs="Segoe UI Emoji"/>
           <w:b/>
           <w:bCs/>
+          <w:noProof/>
         </w:rPr>
         <w:drawing>
           <wp:inline distT="0" distB="0" distL="0" distR="0" wp14:anchorId="3940A2F5" wp14:editId="6031C2C0">
@@ -1649,12 +1661,12 @@
     </w:p>
     <w:p>
       <w:r>
+        <w:lastRenderedPageBreak/>
         <w:t>Se ejecutó la acción Fallar para simular un error en el proceso de pago.</w:t>
       </w:r>
     </w:p>
     <w:p>
       <w:r>
-        <w:lastRenderedPageBreak/>
         <w:t>Resultado:</w:t>
       </w:r>
     </w:p>
@@ -1675,6 +1687,9 @@
         </w:rPr>
       </w:pPr>
       <w:r>
+        <w:rPr>
+          <w:noProof/>
+        </w:rPr>
         <w:drawing>
           <wp:inline distT="0" distB="0" distL="0" distR="0" wp14:anchorId="4C4E289B" wp14:editId="6D78995F">
             <wp:extent cx="5612130" cy="2861310"/>
@@ -1711,6 +1726,14 @@
           </wp:inline>
         </w:drawing>
       </w:r>
+    </w:p>
+    <w:p>
+      <w:pPr>
+        <w:rPr>
+          <w:b/>
+          <w:bCs/>
+        </w:rPr>
+      </w:pPr>
       <w:r>
         <w:rPr>
           <w:b/>
@@ -1746,6 +1769,9 @@
         </w:rPr>
       </w:pPr>
       <w:r>
+        <w:rPr>
+          <w:noProof/>
+        </w:rPr>
         <w:drawing>
           <wp:inline distT="0" distB="0" distL="0" distR="0" wp14:anchorId="65CBD140" wp14:editId="572773F8">
             <wp:extent cx="5612130" cy="3204210"/>
@@ -1825,6 +1851,9 @@
         </w:rPr>
       </w:pPr>
       <w:r>
+        <w:rPr>
+          <w:noProof/>
+        </w:rPr>
         <w:lastRenderedPageBreak/>
         <w:drawing>
           <wp:inline distT="0" distB="0" distL="0" distR="0" wp14:anchorId="7FD5AC10" wp14:editId="4336E3BD">
@@ -24293,6 +24322,7 @@
   <w:style w:type="character" w:default="1" w:styleId="Fuentedeprrafopredeter">
     <w:name w:val="Default Paragraph Font"/>
     <w:uiPriority w:val="1"/>
+    <w:semiHidden/>
     <w:unhideWhenUsed/>
   </w:style>
   <w:style w:type="table" w:default="1" w:styleId="Tablanormal">

</xml_diff>

<commit_message>
delegar autenticación al AuthenticationManager de Spring Security
</commit_message>
<xml_diff>
--- a/docs/ADR/ADR-04-payment-transactional.docx
+++ b/docs/ADR/ADR-04-payment-transactional.docx
@@ -1336,6 +1336,14 @@
           </wp:inline>
         </w:drawing>
       </w:r>
+    </w:p>
+    <w:p>
+      <w:pPr>
+        <w:rPr>
+          <w:b/>
+          <w:bCs/>
+        </w:rPr>
+      </w:pPr>
       <w:r>
         <w:rPr>
           <w:b/>
@@ -1359,12 +1367,12 @@
     </w:p>
     <w:p>
       <w:r>
+        <w:lastRenderedPageBreak/>
         <w:t>La clase quedó definida así:</w:t>
       </w:r>
     </w:p>
     <w:p>
       <w:r>
-        <w:lastRenderedPageBreak/>
         <w:t>@Service</w:t>
       </w:r>
       <w:r>
@@ -1500,6 +1508,9 @@
         </w:rPr>
       </w:pPr>
       <w:r>
+        <w:rPr>
+          <w:noProof/>
+        </w:rPr>
         <w:drawing>
           <wp:inline distT="0" distB="0" distL="0" distR="0" wp14:anchorId="13679059" wp14:editId="07196FB1">
             <wp:extent cx="5612130" cy="1989455"/>
@@ -1602,6 +1613,7 @@
           <w:rFonts w:ascii="Segoe UI Emoji" w:hAnsi="Segoe UI Emoji" w:cs="Segoe UI Emoji"/>
           <w:b/>
           <w:bCs/>
+          <w:noProof/>
         </w:rPr>
         <w:drawing>
           <wp:inline distT="0" distB="0" distL="0" distR="0" wp14:anchorId="3940A2F5" wp14:editId="6031C2C0">
@@ -1649,12 +1661,12 @@
     </w:p>
     <w:p>
       <w:r>
+        <w:lastRenderedPageBreak/>
         <w:t>Se ejecutó la acción Fallar para simular un error en el proceso de pago.</w:t>
       </w:r>
     </w:p>
     <w:p>
       <w:r>
-        <w:lastRenderedPageBreak/>
         <w:t>Resultado:</w:t>
       </w:r>
     </w:p>
@@ -1675,6 +1687,9 @@
         </w:rPr>
       </w:pPr>
       <w:r>
+        <w:rPr>
+          <w:noProof/>
+        </w:rPr>
         <w:drawing>
           <wp:inline distT="0" distB="0" distL="0" distR="0" wp14:anchorId="4C4E289B" wp14:editId="6D78995F">
             <wp:extent cx="5612130" cy="2861310"/>
@@ -1711,6 +1726,14 @@
           </wp:inline>
         </w:drawing>
       </w:r>
+    </w:p>
+    <w:p>
+      <w:pPr>
+        <w:rPr>
+          <w:b/>
+          <w:bCs/>
+        </w:rPr>
+      </w:pPr>
       <w:r>
         <w:rPr>
           <w:b/>
@@ -1746,6 +1769,9 @@
         </w:rPr>
       </w:pPr>
       <w:r>
+        <w:rPr>
+          <w:noProof/>
+        </w:rPr>
         <w:drawing>
           <wp:inline distT="0" distB="0" distL="0" distR="0" wp14:anchorId="65CBD140" wp14:editId="572773F8">
             <wp:extent cx="5612130" cy="3204210"/>
@@ -1825,6 +1851,9 @@
         </w:rPr>
       </w:pPr>
       <w:r>
+        <w:rPr>
+          <w:noProof/>
+        </w:rPr>
         <w:lastRenderedPageBreak/>
         <w:drawing>
           <wp:inline distT="0" distB="0" distL="0" distR="0" wp14:anchorId="7FD5AC10" wp14:editId="4336E3BD">
@@ -24293,6 +24322,7 @@
   <w:style w:type="character" w:default="1" w:styleId="Fuentedeprrafopredeter">
     <w:name w:val="Default Paragraph Font"/>
     <w:uiPriority w:val="1"/>
+    <w:semiHidden/>
     <w:unhideWhenUsed/>
   </w:style>
   <w:style w:type="table" w:default="1" w:styleId="Tablanormal">

</xml_diff>

<commit_message>
feat(pagos): ADR-04 implementación de manejo transaccional en el proceso de pagos
</commit_message>
<xml_diff>
--- a/docs/ADR/ADR-04-payment-transactional.docx
+++ b/docs/ADR/ADR-04-payment-transactional.docx
@@ -1336,6 +1336,14 @@
           </wp:inline>
         </w:drawing>
       </w:r>
+    </w:p>
+    <w:p>
+      <w:pPr>
+        <w:rPr>
+          <w:b/>
+          <w:bCs/>
+        </w:rPr>
+      </w:pPr>
       <w:r>
         <w:rPr>
           <w:b/>
@@ -1359,12 +1367,12 @@
     </w:p>
     <w:p>
       <w:r>
+        <w:lastRenderedPageBreak/>
         <w:t>La clase quedó definida así:</w:t>
       </w:r>
     </w:p>
     <w:p>
       <w:r>
-        <w:lastRenderedPageBreak/>
         <w:t>@Service</w:t>
       </w:r>
       <w:r>
@@ -1500,6 +1508,9 @@
         </w:rPr>
       </w:pPr>
       <w:r>
+        <w:rPr>
+          <w:noProof/>
+        </w:rPr>
         <w:drawing>
           <wp:inline distT="0" distB="0" distL="0" distR="0" wp14:anchorId="13679059" wp14:editId="07196FB1">
             <wp:extent cx="5612130" cy="1989455"/>
@@ -1602,6 +1613,7 @@
           <w:rFonts w:ascii="Segoe UI Emoji" w:hAnsi="Segoe UI Emoji" w:cs="Segoe UI Emoji"/>
           <w:b/>
           <w:bCs/>
+          <w:noProof/>
         </w:rPr>
         <w:drawing>
           <wp:inline distT="0" distB="0" distL="0" distR="0" wp14:anchorId="3940A2F5" wp14:editId="6031C2C0">
@@ -1649,12 +1661,12 @@
     </w:p>
     <w:p>
       <w:r>
+        <w:lastRenderedPageBreak/>
         <w:t>Se ejecutó la acción Fallar para simular un error en el proceso de pago.</w:t>
       </w:r>
     </w:p>
     <w:p>
       <w:r>
-        <w:lastRenderedPageBreak/>
         <w:t>Resultado:</w:t>
       </w:r>
     </w:p>
@@ -1675,6 +1687,9 @@
         </w:rPr>
       </w:pPr>
       <w:r>
+        <w:rPr>
+          <w:noProof/>
+        </w:rPr>
         <w:drawing>
           <wp:inline distT="0" distB="0" distL="0" distR="0" wp14:anchorId="4C4E289B" wp14:editId="6D78995F">
             <wp:extent cx="5612130" cy="2861310"/>
@@ -1711,6 +1726,14 @@
           </wp:inline>
         </w:drawing>
       </w:r>
+    </w:p>
+    <w:p>
+      <w:pPr>
+        <w:rPr>
+          <w:b/>
+          <w:bCs/>
+        </w:rPr>
+      </w:pPr>
       <w:r>
         <w:rPr>
           <w:b/>
@@ -1746,6 +1769,9 @@
         </w:rPr>
       </w:pPr>
       <w:r>
+        <w:rPr>
+          <w:noProof/>
+        </w:rPr>
         <w:drawing>
           <wp:inline distT="0" distB="0" distL="0" distR="0" wp14:anchorId="65CBD140" wp14:editId="572773F8">
             <wp:extent cx="5612130" cy="3204210"/>
@@ -1825,6 +1851,9 @@
         </w:rPr>
       </w:pPr>
       <w:r>
+        <w:rPr>
+          <w:noProof/>
+        </w:rPr>
         <w:lastRenderedPageBreak/>
         <w:drawing>
           <wp:inline distT="0" distB="0" distL="0" distR="0" wp14:anchorId="7FD5AC10" wp14:editId="4336E3BD">
@@ -24293,6 +24322,7 @@
   <w:style w:type="character" w:default="1" w:styleId="Fuentedeprrafopredeter">
     <w:name w:val="Default Paragraph Font"/>
     <w:uiPriority w:val="1"/>
+    <w:semiHidden/>
     <w:unhideWhenUsed/>
   </w:style>
   <w:style w:type="table" w:default="1" w:styleId="Tablanormal">

</xml_diff>